<commit_message>
switch main classifier to CatBoost (acc 63.9%, arb val+6884/test+2243); regen Word/PDF
</commit_message>
<xml_diff>
--- a/code/deliverables/工程报告.docx
+++ b/code/deliverables/工程报告.docx
@@ -986,7 +986,7 @@
           <w:b/>
           <w:sz w:val="24"/>
         </w:rPr>
-        <w:t>决策核心</w:t>
+        <w:t>决策核心（CatBoost）</w:t>
       </w:r>
       <w:r>
         <w:rPr>
@@ -994,23 +994,7 @@
           <w:b w:val="0"/>
           <w:sz w:val="24"/>
         </w:rPr>
-        <w:t xml:space="preserve">：LightGBM </w:t>
-      </w:r>
-      <w:r>
-        <w:rPr>
-          <w:rFonts w:ascii="Times New Roman" w:hAnsi="Times New Roman" w:eastAsia="宋体"/>
-          <w:b/>
-          <w:sz w:val="24"/>
-        </w:rPr>
-        <w:t>方向分类器</w:t>
-      </w:r>
-      <w:r>
-        <w:rPr>
-          <w:rFonts w:ascii="Times New Roman" w:hAnsi="Times New Roman" w:eastAsia="宋体"/>
-          <w:b w:val="0"/>
-          <w:sz w:val="24"/>
-        </w:rPr>
-        <w:t xml:space="preserve">，目标 </w:t>
+        <w:t xml:space="preserve">：方向分类器，目标 </w:t>
       </w:r>
       <w:r>
         <w:rPr>
@@ -1042,7 +1026,7 @@
           <w:b w:val="0"/>
           <w:sz w:val="24"/>
         </w:rPr>
-        <w:t>（二分类 logloss，val 早停）。</w:t>
+        <w:t>（Logloss，val 早停）。实测 CatBoost 在同特征下方向准确率与套利收益均优于 LightGBM（ordered boosting 对小样本+噪声更稳，收益 +30%）。</w:t>
       </w:r>
     </w:p>
     <w:p>
@@ -1078,7 +1062,7 @@
           <w:b w:val="0"/>
           <w:sz w:val="24"/>
         </w:rPr>
-        <w:t>训练用 val 早停，缺省特征由 LightGBM 原生处理 NaN。</w:t>
+        <w:t>训练用 val 早停，缺省特征由模型原生处理 NaN。</w:t>
       </w:r>
     </w:p>
     <w:p>
@@ -1370,7 +1354,7 @@
                 <w:b w:val="0"/>
                 <w:sz w:val="21"/>
               </w:rPr>
-              <w:t>1931 (53%)</w:t>
+              <w:t>1996 (55%)</w:t>
             </w:r>
           </w:p>
         </w:tc>
@@ -1385,7 +1369,7 @@
                 <w:b/>
                 <w:sz w:val="21"/>
               </w:rPr>
-              <w:t>69.9%</w:t>
+              <w:t>71.3%</w:t>
             </w:r>
           </w:p>
         </w:tc>
@@ -1400,7 +1384,7 @@
                 <w:b/>
                 <w:sz w:val="21"/>
               </w:rPr>
-              <w:t>+5483</w:t>
+              <w:t>+6884</w:t>
             </w:r>
           </w:p>
         </w:tc>
@@ -1468,7 +1452,7 @@
                 <w:b w:val="0"/>
                 <w:sz w:val="21"/>
               </w:rPr>
-              <w:t>958 (61%)</w:t>
+              <w:t>1018 (65%)</w:t>
             </w:r>
           </w:p>
         </w:tc>
@@ -1483,7 +1467,7 @@
                 <w:b/>
                 <w:sz w:val="21"/>
               </w:rPr>
-              <w:t>68.0%</w:t>
+              <w:t>68.8%</w:t>
             </w:r>
           </w:p>
         </w:tc>
@@ -1498,7 +1482,7 @@
                 <w:b/>
                 <w:sz w:val="21"/>
               </w:rPr>
-              <w:t>+1808</w:t>
+              <w:t>+2243</w:t>
             </w:r>
           </w:p>
         </w:tc>
@@ -1575,7 +1559,7 @@
                 <w:b w:val="0"/>
                 <w:sz w:val="21"/>
               </w:rPr>
-              <w:t>19 (1%)</w:t>
+              <w:t>0 (0%)</w:t>
             </w:r>
           </w:p>
         </w:tc>
@@ -1590,7 +1574,7 @@
                 <w:b w:val="0"/>
                 <w:sz w:val="21"/>
               </w:rPr>
-              <w:t>10.5%</w:t>
+              <w:t>—</w:t>
             </w:r>
           </w:p>
         </w:tc>
@@ -1605,7 +1589,7 @@
                 <w:b w:val="0"/>
                 <w:sz w:val="21"/>
               </w:rPr>
-              <w:t>-409</w:t>
+              <w:t>0</w:t>
             </w:r>
           </w:p>
         </w:tc>
@@ -1673,7 +1657,7 @@
                 <w:b w:val="0"/>
                 <w:sz w:val="21"/>
               </w:rPr>
-              <w:t>2 (0%)</w:t>
+              <w:t>0 (0%)</w:t>
             </w:r>
           </w:p>
         </w:tc>
@@ -1688,7 +1672,7 @@
                 <w:b w:val="0"/>
                 <w:sz w:val="21"/>
               </w:rPr>
-              <w:t>0%</w:t>
+              <w:t>—</w:t>
             </w:r>
           </w:p>
         </w:tc>
@@ -1703,7 +1687,7 @@
                 <w:b w:val="0"/>
                 <w:sz w:val="21"/>
               </w:rPr>
-              <w:t>-64</w:t>
+              <w:t>0</w:t>
             </w:r>
           </w:p>
         </w:tc>
@@ -1780,7 +1764,7 @@
                 <w:b w:val="0"/>
                 <w:sz w:val="21"/>
               </w:rPr>
-              <w:t>1950</w:t>
+              <w:t>1996</w:t>
             </w:r>
           </w:p>
         </w:tc>
@@ -1795,7 +1779,7 @@
                 <w:b w:val="0"/>
                 <w:sz w:val="21"/>
               </w:rPr>
-              <w:t>69.3%</w:t>
+              <w:t>71.3%</w:t>
             </w:r>
           </w:p>
         </w:tc>
@@ -1810,7 +1794,7 @@
                 <w:b/>
                 <w:sz w:val="21"/>
               </w:rPr>
-              <w:t>+5074</w:t>
+              <w:t>+6884</w:t>
             </w:r>
           </w:p>
         </w:tc>
@@ -1878,7 +1862,7 @@
                 <w:b w:val="0"/>
                 <w:sz w:val="21"/>
               </w:rPr>
-              <w:t>960</w:t>
+              <w:t>1018</w:t>
             </w:r>
           </w:p>
         </w:tc>
@@ -1893,7 +1877,7 @@
                 <w:b w:val="0"/>
                 <w:sz w:val="21"/>
               </w:rPr>
-              <w:t>67.8%</w:t>
+              <w:t>68.8%</w:t>
             </w:r>
           </w:p>
         </w:tc>
@@ -1908,7 +1892,7 @@
                 <w:b/>
                 <w:sz w:val="21"/>
               </w:rPr>
-              <w:t>+1744</w:t>
+              <w:t>+2243</w:t>
             </w:r>
           </w:p>
         </w:tc>
@@ -1990,7 +1974,7 @@
           <w:b w:val="0"/>
           <w:sz w:val="24"/>
         </w:rPr>
-        <w:t>：该节点价差系统性偏正（约 2/3 时间 DA&gt;RTPD），模型预测正价差命中 68–70%，且幅度小（±10）风险可控 → 稳定盈利。</w:t>
+        <w:t>：该节点价差系统性偏正（约 2/3 时间 DA&gt;RTPD），模型预测正价差命中 69–71%，且幅度小（±10）风险可控 → 稳定盈利。</w:t>
       </w:r>
     </w:p>
     <w:p>
@@ -2004,7 +1988,7 @@
           <w:b/>
           <w:sz w:val="24"/>
         </w:rPr>
-        <w:t>CONTROLX 几乎不参与</w:t>
+        <w:t>CONTROLX 完全不参与</w:t>
       </w:r>
       <w:r>
         <w:rPr>
@@ -2012,7 +1996,7 @@
           <w:b w:val="0"/>
           <w:sz w:val="24"/>
         </w:rPr>
-        <w:t>：实际正价差只占 26–34%，模型对其"预测正价差"信号弱（命中仅 10%），单边规则下几乎不触发交易，避免了大幅度节点的亏损。</w:t>
+        <w:t>：CatBoost 对其从未触发"预测正价差"（其实际正价差只占 26–34%），单边规则下交易数为 0，彻底规避了大幅节点的亏损风险。</w:t>
       </w:r>
     </w:p>
     <w:p>
@@ -2040,7 +2024,7 @@
           <w:b/>
           <w:sz w:val="32"/>
         </w:rPr>
-        <w:t>5. 影响因子占比（方向分类器 特征重要性，按 gain）</w:t>
+        <w:t>5. 影响因子占比（方向分类器 CatBoost 特征重要性）</w:t>
       </w:r>
     </w:p>
     <w:tbl>
@@ -2145,7 +2129,7 @@
                 <w:b w:val="0"/>
                 <w:sz w:val="21"/>
               </w:rPr>
-              <w:t>da_lag1（D-1 日前价）</w:t>
+              <w:t>da_lag2（D-2 日前价）</w:t>
             </w:r>
           </w:p>
         </w:tc>
@@ -2160,7 +2144,7 @@
                 <w:b/>
                 <w:sz w:val="21"/>
               </w:rPr>
-              <w:t>31.2%</w:t>
+              <w:t>15.8%</w:t>
             </w:r>
           </w:p>
         </w:tc>
@@ -2192,7 +2176,7 @@
                 <w:b w:val="0"/>
                 <w:sz w:val="21"/>
               </w:rPr>
-              <w:t>da_lag2（D-2 日前价）</w:t>
+              <w:t>spread_std14（14日价差波动）</w:t>
             </w:r>
           </w:p>
         </w:tc>
@@ -2207,7 +2191,7 @@
                 <w:b/>
                 <w:sz w:val="21"/>
               </w:rPr>
-              <w:t>24.9%</w:t>
+              <w:t>13.1%</w:t>
             </w:r>
           </w:p>
         </w:tc>
@@ -2239,7 +2223,7 @@
                 <w:b w:val="0"/>
                 <w:sz w:val="21"/>
               </w:rPr>
-              <w:t>month_next（月份）</w:t>
+              <w:t>spread_std7（7日价差波动）</w:t>
             </w:r>
           </w:p>
         </w:tc>
@@ -2254,7 +2238,7 @@
                 <w:b w:val="0"/>
                 <w:sz w:val="21"/>
               </w:rPr>
-              <w:t>4.4%</w:t>
+              <w:t>7.8%</w:t>
             </w:r>
           </w:p>
         </w:tc>
@@ -2286,7 +2270,7 @@
                 <w:b w:val="0"/>
                 <w:sz w:val="21"/>
               </w:rPr>
-              <w:t>load_2da_next（D+1 负荷预测）</w:t>
+              <w:t>node（节点）</w:t>
             </w:r>
           </w:p>
         </w:tc>
@@ -2301,7 +2285,7 @@
                 <w:b w:val="0"/>
                 <w:sz w:val="21"/>
               </w:rPr>
-              <w:t>4.2%</w:t>
+              <w:t>6.9%</w:t>
             </w:r>
           </w:p>
         </w:tc>
@@ -2333,7 +2317,289 @@
                 <w:b w:val="0"/>
                 <w:sz w:val="21"/>
               </w:rPr>
+              <w:t>month_next（月份）</w:t>
+            </w:r>
+          </w:p>
+        </w:tc>
+        <w:tc>
+          <w:tcPr>
+            <w:tcW w:type="dxa" w:w="2911"/>
+          </w:tcPr>
+          <w:p>
+            <w:r>
+              <w:rPr>
+                <w:rFonts w:ascii="Times New Roman" w:hAnsi="Times New Roman" w:eastAsia="宋体"/>
+                <w:b w:val="0"/>
+                <w:sz w:val="21"/>
+              </w:rPr>
+              <w:t>5.6%</w:t>
+            </w:r>
+          </w:p>
+        </w:tc>
+      </w:tr>
+      <w:tr>
+        <w:tc>
+          <w:tcPr>
+            <w:tcW w:type="dxa" w:w="2911"/>
+          </w:tcPr>
+          <w:p>
+            <w:r>
+              <w:rPr>
+                <w:rFonts w:ascii="Times New Roman" w:hAnsi="Times New Roman" w:eastAsia="宋体"/>
+                <w:b w:val="0"/>
+                <w:sz w:val="21"/>
+              </w:rPr>
+              <w:t>6</w:t>
+            </w:r>
+          </w:p>
+        </w:tc>
+        <w:tc>
+          <w:tcPr>
+            <w:tcW w:type="dxa" w:w="2911"/>
+          </w:tcPr>
+          <w:p>
+            <w:r>
+              <w:rPr>
+                <w:rFonts w:ascii="Times New Roman" w:hAnsi="Times New Roman" w:eastAsia="宋体"/>
+                <w:b w:val="0"/>
+                <w:sz w:val="21"/>
+              </w:rPr>
+              <w:t>da_lag1（D-1 日前价）</w:t>
+            </w:r>
+          </w:p>
+        </w:tc>
+        <w:tc>
+          <w:tcPr>
+            <w:tcW w:type="dxa" w:w="2911"/>
+          </w:tcPr>
+          <w:p>
+            <w:r>
+              <w:rPr>
+                <w:rFonts w:ascii="Times New Roman" w:hAnsi="Times New Roman" w:eastAsia="宋体"/>
+                <w:b w:val="0"/>
+                <w:sz w:val="21"/>
+              </w:rPr>
+              <w:t>5.5%</w:t>
+            </w:r>
+          </w:p>
+        </w:tc>
+      </w:tr>
+      <w:tr>
+        <w:tc>
+          <w:tcPr>
+            <w:tcW w:type="dxa" w:w="2911"/>
+          </w:tcPr>
+          <w:p>
+            <w:r>
+              <w:rPr>
+                <w:rFonts w:ascii="Times New Roman" w:hAnsi="Times New Roman" w:eastAsia="宋体"/>
+                <w:b w:val="0"/>
+                <w:sz w:val="21"/>
+              </w:rPr>
+              <w:t>7</w:t>
+            </w:r>
+          </w:p>
+        </w:tc>
+        <w:tc>
+          <w:tcPr>
+            <w:tcW w:type="dxa" w:w="2911"/>
+          </w:tcPr>
+          <w:p>
+            <w:r>
+              <w:rPr>
+                <w:rFonts w:ascii="Times New Roman" w:hAnsi="Times New Roman" w:eastAsia="宋体"/>
+                <w:b w:val="0"/>
+                <w:sz w:val="21"/>
+              </w:rPr>
+              <w:t>peer_rtpd_lag1（关联节点实时价）</w:t>
+            </w:r>
+          </w:p>
+        </w:tc>
+        <w:tc>
+          <w:tcPr>
+            <w:tcW w:type="dxa" w:w="2911"/>
+          </w:tcPr>
+          <w:p>
+            <w:r>
+              <w:rPr>
+                <w:rFonts w:ascii="Times New Roman" w:hAnsi="Times New Roman" w:eastAsia="宋体"/>
+                <w:b w:val="0"/>
+                <w:sz w:val="21"/>
+              </w:rPr>
+              <w:t>5.0%</w:t>
+            </w:r>
+          </w:p>
+        </w:tc>
+      </w:tr>
+      <w:tr>
+        <w:tc>
+          <w:tcPr>
+            <w:tcW w:type="dxa" w:w="2911"/>
+          </w:tcPr>
+          <w:p>
+            <w:r>
+              <w:rPr>
+                <w:rFonts w:ascii="Times New Roman" w:hAnsi="Times New Roman" w:eastAsia="宋体"/>
+                <w:b w:val="0"/>
+                <w:sz w:val="21"/>
+              </w:rPr>
+              <w:t>8</w:t>
+            </w:r>
+          </w:p>
+        </w:tc>
+        <w:tc>
+          <w:tcPr>
+            <w:tcW w:type="dxa" w:w="2911"/>
+          </w:tcPr>
+          <w:p>
+            <w:r>
+              <w:rPr>
+                <w:rFonts w:ascii="Times New Roman" w:hAnsi="Times New Roman" w:eastAsia="宋体"/>
+                <w:b w:val="0"/>
+                <w:sz w:val="21"/>
+              </w:rPr>
+              <w:t>load_2da_next（D+1 负荷预测）</w:t>
+            </w:r>
+          </w:p>
+        </w:tc>
+        <w:tc>
+          <w:tcPr>
+            <w:tcW w:type="dxa" w:w="2911"/>
+          </w:tcPr>
+          <w:p>
+            <w:r>
+              <w:rPr>
+                <w:rFonts w:ascii="Times New Roman" w:hAnsi="Times New Roman" w:eastAsia="宋体"/>
+                <w:b w:val="0"/>
+                <w:sz w:val="21"/>
+              </w:rPr>
+              <w:t>5.0%</w:t>
+            </w:r>
+          </w:p>
+        </w:tc>
+      </w:tr>
+      <w:tr>
+        <w:tc>
+          <w:tcPr>
+            <w:tcW w:type="dxa" w:w="2911"/>
+          </w:tcPr>
+          <w:p>
+            <w:r>
+              <w:rPr>
+                <w:rFonts w:ascii="Times New Roman" w:hAnsi="Times New Roman" w:eastAsia="宋体"/>
+                <w:b w:val="0"/>
+                <w:sz w:val="21"/>
+              </w:rPr>
+              <w:t>9</w:t>
+            </w:r>
+          </w:p>
+        </w:tc>
+        <w:tc>
+          <w:tcPr>
+            <w:tcW w:type="dxa" w:w="2911"/>
+          </w:tcPr>
+          <w:p>
+            <w:r>
+              <w:rPr>
+                <w:rFonts w:ascii="Times New Roman" w:hAnsi="Times New Roman" w:eastAsia="宋体"/>
+                <w:b w:val="0"/>
+                <w:sz w:val="21"/>
+              </w:rPr>
               <w:t>da_lag7（D-7 日前价）</w:t>
+            </w:r>
+          </w:p>
+        </w:tc>
+        <w:tc>
+          <w:tcPr>
+            <w:tcW w:type="dxa" w:w="2911"/>
+          </w:tcPr>
+          <w:p>
+            <w:r>
+              <w:rPr>
+                <w:rFonts w:ascii="Times New Roman" w:hAnsi="Times New Roman" w:eastAsia="宋体"/>
+                <w:b w:val="0"/>
+                <w:sz w:val="21"/>
+              </w:rPr>
+              <w:t>4.5%</w:t>
+            </w:r>
+          </w:p>
+        </w:tc>
+      </w:tr>
+      <w:tr>
+        <w:tc>
+          <w:tcPr>
+            <w:tcW w:type="dxa" w:w="2911"/>
+          </w:tcPr>
+          <w:p>
+            <w:r>
+              <w:rPr>
+                <w:rFonts w:ascii="Times New Roman" w:hAnsi="Times New Roman" w:eastAsia="宋体"/>
+                <w:b w:val="0"/>
+                <w:sz w:val="21"/>
+              </w:rPr>
+              <w:t>10</w:t>
+            </w:r>
+          </w:p>
+        </w:tc>
+        <w:tc>
+          <w:tcPr>
+            <w:tcW w:type="dxa" w:w="2911"/>
+          </w:tcPr>
+          <w:p>
+            <w:r>
+              <w:rPr>
+                <w:rFonts w:ascii="Times New Roman" w:hAnsi="Times New Roman" w:eastAsia="宋体"/>
+                <w:b w:val="0"/>
+                <w:sz w:val="21"/>
+              </w:rPr>
+              <w:t>rtpd_lag1（D-1 实时价）</w:t>
+            </w:r>
+          </w:p>
+        </w:tc>
+        <w:tc>
+          <w:tcPr>
+            <w:tcW w:type="dxa" w:w="2911"/>
+          </w:tcPr>
+          <w:p>
+            <w:r>
+              <w:rPr>
+                <w:rFonts w:ascii="Times New Roman" w:hAnsi="Times New Roman" w:eastAsia="宋体"/>
+                <w:b w:val="0"/>
+                <w:sz w:val="21"/>
+              </w:rPr>
+              <w:t>4.5%</w:t>
+            </w:r>
+          </w:p>
+        </w:tc>
+      </w:tr>
+      <w:tr>
+        <w:tc>
+          <w:tcPr>
+            <w:tcW w:type="dxa" w:w="2911"/>
+          </w:tcPr>
+          <w:p>
+            <w:r>
+              <w:rPr>
+                <w:rFonts w:ascii="Times New Roman" w:hAnsi="Times New Roman" w:eastAsia="宋体"/>
+                <w:b w:val="0"/>
+                <w:sz w:val="21"/>
+              </w:rPr>
+              <w:t>11</w:t>
+            </w:r>
+          </w:p>
+        </w:tc>
+        <w:tc>
+          <w:tcPr>
+            <w:tcW w:type="dxa" w:w="2911"/>
+          </w:tcPr>
+          <w:p>
+            <w:r>
+              <w:rPr>
+                <w:rFonts w:ascii="Times New Roman" w:hAnsi="Times New Roman" w:eastAsia="宋体"/>
+                <w:b w:val="0"/>
+                <w:sz w:val="21"/>
+              </w:rPr>
+              <w:t>ssrd_next（D+1 太阳辐射）</w:t>
             </w:r>
           </w:p>
         </w:tc>
@@ -2365,7 +2631,7 @@
                 <w:b w:val="0"/>
                 <w:sz w:val="21"/>
               </w:rPr>
-              <w:t>6</w:t>
+              <w:t>12</w:t>
             </w:r>
           </w:p>
         </w:tc>
@@ -2380,7 +2646,7 @@
                 <w:b w:val="0"/>
                 <w:sz w:val="21"/>
               </w:rPr>
-              <w:t>t2m_next（D+1 温度）</w:t>
+              <w:t>spread_lag7</w:t>
             </w:r>
           </w:p>
         </w:tc>
@@ -2395,195 +2661,7 @@
                 <w:b w:val="0"/>
                 <w:sz w:val="21"/>
               </w:rPr>
-              <w:t>3.1%</w:t>
-            </w:r>
-          </w:p>
-        </w:tc>
-      </w:tr>
-      <w:tr>
-        <w:tc>
-          <w:tcPr>
-            <w:tcW w:type="dxa" w:w="2911"/>
-          </w:tcPr>
-          <w:p>
-            <w:r>
-              <w:rPr>
-                <w:rFonts w:ascii="Times New Roman" w:hAnsi="Times New Roman" w:eastAsia="宋体"/>
-                <w:b w:val="0"/>
-                <w:sz w:val="21"/>
-              </w:rPr>
-              <w:t>7</w:t>
-            </w:r>
-          </w:p>
-        </w:tc>
-        <w:tc>
-          <w:tcPr>
-            <w:tcW w:type="dxa" w:w="2911"/>
-          </w:tcPr>
-          <w:p>
-            <w:r>
-              <w:rPr>
-                <w:rFonts w:ascii="Times New Roman" w:hAnsi="Times New Roman" w:eastAsia="宋体"/>
-                <w:b w:val="0"/>
-                <w:sz w:val="21"/>
-              </w:rPr>
-              <w:t>rtpd_lag7</w:t>
-            </w:r>
-          </w:p>
-        </w:tc>
-        <w:tc>
-          <w:tcPr>
-            <w:tcW w:type="dxa" w:w="2911"/>
-          </w:tcPr>
-          <w:p>
-            <w:r>
-              <w:rPr>
-                <w:rFonts w:ascii="Times New Roman" w:hAnsi="Times New Roman" w:eastAsia="宋体"/>
-                <w:b w:val="0"/>
-                <w:sz w:val="21"/>
-              </w:rPr>
-              <w:t>3.0%</w:t>
-            </w:r>
-          </w:p>
-        </w:tc>
-      </w:tr>
-      <w:tr>
-        <w:tc>
-          <w:tcPr>
-            <w:tcW w:type="dxa" w:w="2911"/>
-          </w:tcPr>
-          <w:p>
-            <w:r>
-              <w:rPr>
-                <w:rFonts w:ascii="Times New Roman" w:hAnsi="Times New Roman" w:eastAsia="宋体"/>
-                <w:b w:val="0"/>
-                <w:sz w:val="21"/>
-              </w:rPr>
-              <w:t>8</w:t>
-            </w:r>
-          </w:p>
-        </w:tc>
-        <w:tc>
-          <w:tcPr>
-            <w:tcW w:type="dxa" w:w="2911"/>
-          </w:tcPr>
-          <w:p>
-            <w:r>
-              <w:rPr>
-                <w:rFonts w:ascii="Times New Roman" w:hAnsi="Times New Roman" w:eastAsia="宋体"/>
-                <w:b w:val="0"/>
-                <w:sz w:val="21"/>
-              </w:rPr>
-              <w:t>wind100_next（D+1 风速）</w:t>
-            </w:r>
-          </w:p>
-        </w:tc>
-        <w:tc>
-          <w:tcPr>
-            <w:tcW w:type="dxa" w:w="2911"/>
-          </w:tcPr>
-          <w:p>
-            <w:r>
-              <w:rPr>
-                <w:rFonts w:ascii="Times New Roman" w:hAnsi="Times New Roman" w:eastAsia="宋体"/>
-                <w:b w:val="0"/>
-                <w:sz w:val="21"/>
-              </w:rPr>
-              <w:t>2.8%</w:t>
-            </w:r>
-          </w:p>
-        </w:tc>
-      </w:tr>
-      <w:tr>
-        <w:tc>
-          <w:tcPr>
-            <w:tcW w:type="dxa" w:w="2911"/>
-          </w:tcPr>
-          <w:p>
-            <w:r>
-              <w:rPr>
-                <w:rFonts w:ascii="Times New Roman" w:hAnsi="Times New Roman" w:eastAsia="宋体"/>
-                <w:b w:val="0"/>
-                <w:sz w:val="21"/>
-              </w:rPr>
-              <w:t>9</w:t>
-            </w:r>
-          </w:p>
-        </w:tc>
-        <w:tc>
-          <w:tcPr>
-            <w:tcW w:type="dxa" w:w="2911"/>
-          </w:tcPr>
-          <w:p>
-            <w:r>
-              <w:rPr>
-                <w:rFonts w:ascii="Times New Roman" w:hAnsi="Times New Roman" w:eastAsia="宋体"/>
-                <w:b w:val="0"/>
-                <w:sz w:val="21"/>
-              </w:rPr>
-              <w:t>spread_std30</w:t>
-            </w:r>
-          </w:p>
-        </w:tc>
-        <w:tc>
-          <w:tcPr>
-            <w:tcW w:type="dxa" w:w="2911"/>
-          </w:tcPr>
-          <w:p>
-            <w:r>
-              <w:rPr>
-                <w:rFonts w:ascii="Times New Roman" w:hAnsi="Times New Roman" w:eastAsia="宋体"/>
-                <w:b w:val="0"/>
-                <w:sz w:val="21"/>
-              </w:rPr>
-              <w:t>2.4%</w:t>
-            </w:r>
-          </w:p>
-        </w:tc>
-      </w:tr>
-      <w:tr>
-        <w:tc>
-          <w:tcPr>
-            <w:tcW w:type="dxa" w:w="2911"/>
-          </w:tcPr>
-          <w:p>
-            <w:r>
-              <w:rPr>
-                <w:rFonts w:ascii="Times New Roman" w:hAnsi="Times New Roman" w:eastAsia="宋体"/>
-                <w:b w:val="0"/>
-                <w:sz w:val="21"/>
-              </w:rPr>
-              <w:t>10</w:t>
-            </w:r>
-          </w:p>
-        </w:tc>
-        <w:tc>
-          <w:tcPr>
-            <w:tcW w:type="dxa" w:w="2911"/>
-          </w:tcPr>
-          <w:p>
-            <w:r>
-              <w:rPr>
-                <w:rFonts w:ascii="Times New Roman" w:hAnsi="Times New Roman" w:eastAsia="宋体"/>
-                <w:b w:val="0"/>
-                <w:sz w:val="21"/>
-              </w:rPr>
-              <w:t>dow_next（星期）</w:t>
-            </w:r>
-          </w:p>
-        </w:tc>
-        <w:tc>
-          <w:tcPr>
-            <w:tcW w:type="dxa" w:w="2911"/>
-          </w:tcPr>
-          <w:p>
-            <w:r>
-              <w:rPr>
-                <w:rFonts w:ascii="Times New Roman" w:hAnsi="Times New Roman" w:eastAsia="宋体"/>
-                <w:b w:val="0"/>
-                <w:sz w:val="21"/>
-              </w:rPr>
-              <w:t>2.3%</w:t>
+              <w:t>3.5%</w:t>
             </w:r>
           </w:p>
         </w:tc>
@@ -2621,7 +2699,7 @@
           <w:b/>
           <w:sz w:val="24"/>
         </w:rPr>
-        <w:t>72.8%</w:t>
+        <w:t>44.4%</w:t>
       </w:r>
       <w:r>
         <w:rPr>
@@ -2629,7 +2707,23 @@
           <w:b w:val="0"/>
           <w:sz w:val="24"/>
         </w:rPr>
-        <w:t>（其中 DA 价滞后约 60%）｜ 未来预报（负荷/天气）18.3% ｜ 日历 8.2% ｜ 滚动统计 6.9% ｜ 节点 0.7%。</w:t>
+        <w:t xml:space="preserve"> ｜ 滚动统计（价差波动）</w:t>
+      </w:r>
+      <w:r>
+        <w:rPr>
+          <w:rFonts w:ascii="Times New Roman" w:hAnsi="Times New Roman" w:eastAsia="宋体"/>
+          <w:b/>
+          <w:sz w:val="24"/>
+        </w:rPr>
+        <w:t>24.1%</w:t>
+      </w:r>
+      <w:r>
+        <w:rPr>
+          <w:rFonts w:ascii="Times New Roman" w:hAnsi="Times New Roman" w:eastAsia="宋体"/>
+          <w:b w:val="0"/>
+          <w:sz w:val="24"/>
+        </w:rPr>
+        <w:t xml:space="preserve"> ｜ 未来预报（负荷/天气）22.9% ｜ 日历 9.7% ｜ 节点 6.9%。</w:t>
       </w:r>
     </w:p>
     <w:p>
@@ -2651,7 +2745,7 @@
           <w:b w:val="0"/>
           <w:sz w:val="24"/>
         </w:rPr>
-        <w:t xml:space="preserve">：方向信号主要来自 </w:t>
+        <w:t>：历史价格（尤其 DA 价滞后）仍是最强信号；但 CatBoost 视角下</w:t>
       </w:r>
       <w:r>
         <w:rPr>
@@ -2659,7 +2753,7 @@
           <w:b/>
           <w:sz w:val="24"/>
         </w:rPr>
-        <w:t>DA 价的滞后结构</w:t>
+        <w:t>价差波动特征（std14/std7）权重显著上升</w:t>
       </w:r>
       <w:r>
         <w:rPr>
@@ -2667,7 +2761,7 @@
           <w:b w:val="0"/>
           <w:sz w:val="24"/>
         </w:rPr>
-        <w:t>（DA 价是 T-1 已确定的撮合价，对次日价差方向最具预示力）；其次 D+1 的负荷与天气预报（供给侧之外的系统状态）。</w:t>
+        <w:t>——波动性对"该不该下单"（观望/交易）的判断很重要；其次是 D+1 负荷与天气预报、节点差异。</w:t>
       </w:r>
     </w:p>
     <w:p>
@@ -2750,7 +2844,7 @@
                 <w:b/>
                 <w:sz w:val="21"/>
               </w:rPr>
-              <w:t>本工程（单边策略）</w:t>
+              <w:t>本工程（单边策略，CatBoost）</w:t>
             </w:r>
           </w:p>
         </w:tc>
@@ -2765,7 +2859,7 @@
                 <w:b/>
                 <w:sz w:val="21"/>
               </w:rPr>
-              <w:t>+1744</w:t>
+              <w:t>+2243</w:t>
             </w:r>
           </w:p>
         </w:tc>
@@ -2975,7 +3069,7 @@
           <w:b w:val="0"/>
           <w:sz w:val="24"/>
         </w:rPr>
-        <w:t>：整体方向准确率（sign 预测 vs 实际）62.6%；</w:t>
+        <w:t>：整体方向准确率（sign 预测 vs 实际）63.9%；</w:t>
       </w:r>
       <w:r>
         <w:rPr>
@@ -2991,7 +3085,7 @@
           <w:b w:val="0"/>
           <w:sz w:val="24"/>
         </w:rPr>
-        <w:t xml:space="preserve"> 67.8%（只看实际下单的样本，更贴业务）。</w:t>
+        <w:t xml:space="preserve"> 68.8%（只看实际下单的样本，更贴业务）。</w:t>
       </w:r>
     </w:p>
     <w:p>
@@ -3111,7 +3205,7 @@
           <w:b w:val="0"/>
           <w:sz w:val="24"/>
         </w:rPr>
-        <w:t>：val（2026 H1）与 test（2026 H2）双时段都为正收益（+5074 / +1744），避免只在测试集上调参的过拟合。</w:t>
+        <w:t>：val（2026 H1）与 test（2026 H2）双时段都为正收益（+6884 / +2243），避免只在测试集上调参的过拟合。</w:t>
       </w:r>
     </w:p>
     <w:p>
@@ -3151,7 +3245,7 @@
           <w:b w:val="0"/>
           <w:sz w:val="24"/>
         </w:rPr>
-        <w:t>：val +5074 / test +1744，日均约 27–60——价差本身难预测，方向 62.6% 带来的收益空间有限。</w:t>
+        <w:t>：val +6884 / test +2243，日均约 35–100——价差本身难预测，方向 63.9% 带来的收益空间有限。</w:t>
       </w:r>
     </w:p>
     <w:p>

</xml_diff>

<commit_message>
add ELCAJNGT model (cold-start, unreliable, -8833 backtest, reference only); 3-node pipeline
</commit_message>
<xml_diff>
--- a/code/deliverables/工程报告.docx
+++ b/code/deliverables/工程报告.docx
@@ -608,23 +608,7 @@
           <w:b w:val="0"/>
           <w:sz w:val="24"/>
         </w:rPr>
-        <w:t>：SNLNDRO、CONTROLX（ZP26，已建模）；ELCAJNGT（SP15，数据仅 2026-03 起、训练窗口 0 样本，</w:t>
-      </w:r>
-      <w:r>
-        <w:rPr>
-          <w:rFonts w:ascii="Times New Roman" w:hAnsi="Times New Roman" w:eastAsia="宋体"/>
-          <w:b/>
-          <w:sz w:val="24"/>
-        </w:rPr>
-        <w:t>未建模</w:t>
-      </w:r>
-      <w:r>
-        <w:rPr>
-          <w:rFonts w:ascii="Times New Roman" w:hAnsi="Times New Roman" w:eastAsia="宋体"/>
-          <w:b w:val="0"/>
-          <w:sz w:val="24"/>
-        </w:rPr>
-        <w:t>）。</w:t>
+        <w:t>：SNLNDRO、CONTROLX（ZP26，已建模，主策略）；ELCAJNGT（SP15，数据仅 2026-03 起，已单独训练但样本少、不可靠，仅参考）。</w:t>
       </w:r>
     </w:p>
     <w:p>
@@ -1734,7 +1718,122 @@
                 <w:b/>
                 <w:sz w:val="21"/>
               </w:rPr>
-              <w:t>整体</w:t>
+              <w:t>ELCAJNGT</w:t>
+            </w:r>
+            <w:r>
+              <w:rPr>
+                <w:rFonts w:ascii="Times New Roman" w:hAnsi="Times New Roman" w:eastAsia="宋体"/>
+                <w:b w:val="0"/>
+                <w:sz w:val="21"/>
+              </w:rPr>
+              <w:t xml:space="preserve"> ⚠</w:t>
+            </w:r>
+          </w:p>
+        </w:tc>
+        <w:tc>
+          <w:tcPr>
+            <w:tcW w:type="dxa" w:w="1247"/>
+          </w:tcPr>
+          <w:p>
+            <w:r>
+              <w:rPr>
+                <w:rFonts w:ascii="Times New Roman" w:hAnsi="Times New Roman" w:eastAsia="宋体"/>
+                <w:b w:val="0"/>
+                <w:sz w:val="21"/>
+              </w:rPr>
+              <w:t>test</w:t>
+            </w:r>
+          </w:p>
+        </w:tc>
+        <w:tc>
+          <w:tcPr>
+            <w:tcW w:type="dxa" w:w="1247"/>
+          </w:tcPr>
+          <w:p>
+            <w:r>
+              <w:rPr>
+                <w:rFonts w:ascii="Times New Roman" w:hAnsi="Times New Roman" w:eastAsia="宋体"/>
+                <w:b w:val="0"/>
+                <w:sz w:val="21"/>
+              </w:rPr>
+              <w:t>1455 (93%)</w:t>
+            </w:r>
+          </w:p>
+        </w:tc>
+        <w:tc>
+          <w:tcPr>
+            <w:tcW w:type="dxa" w:w="1247"/>
+          </w:tcPr>
+          <w:p>
+            <w:r>
+              <w:rPr>
+                <w:rFonts w:ascii="Times New Roman" w:hAnsi="Times New Roman" w:eastAsia="宋体"/>
+                <w:b w:val="0"/>
+                <w:sz w:val="21"/>
+              </w:rPr>
+              <w:t>62.7%</w:t>
+            </w:r>
+          </w:p>
+        </w:tc>
+        <w:tc>
+          <w:tcPr>
+            <w:tcW w:type="dxa" w:w="1247"/>
+          </w:tcPr>
+          <w:p>
+            <w:r>
+              <w:rPr>
+                <w:rFonts w:ascii="Times New Roman" w:hAnsi="Times New Roman" w:eastAsia="宋体"/>
+                <w:b/>
+                <w:sz w:val="21"/>
+              </w:rPr>
+              <w:t>-8833</w:t>
+            </w:r>
+          </w:p>
+        </w:tc>
+        <w:tc>
+          <w:tcPr>
+            <w:tcW w:type="dxa" w:w="1247"/>
+          </w:tcPr>
+          <w:p>
+            <w:r>
+              <w:rPr>
+                <w:rFonts w:ascii="Times New Roman" w:hAnsi="Times New Roman" w:eastAsia="宋体"/>
+                <w:b w:val="0"/>
+                <w:sz w:val="21"/>
+              </w:rPr>
+              <w:t>62.5%</w:t>
+            </w:r>
+          </w:p>
+        </w:tc>
+        <w:tc>
+          <w:tcPr>
+            <w:tcW w:type="dxa" w:w="1247"/>
+          </w:tcPr>
+          <w:p>
+            <w:r>
+              <w:rPr>
+                <w:rFonts w:ascii="Times New Roman" w:hAnsi="Times New Roman" w:eastAsia="宋体"/>
+                <w:b w:val="0"/>
+                <w:sz w:val="21"/>
+              </w:rPr>
+              <w:t>32.6</w:t>
+            </w:r>
+          </w:p>
+        </w:tc>
+      </w:tr>
+      <w:tr>
+        <w:tc>
+          <w:tcPr>
+            <w:tcW w:type="dxa" w:w="1247"/>
+          </w:tcPr>
+          <w:p>
+            <w:r>
+              <w:rPr>
+                <w:rFonts w:ascii="Times New Roman" w:hAnsi="Times New Roman" w:eastAsia="宋体"/>
+                <w:b/>
+                <w:sz w:val="21"/>
+              </w:rPr>
+              <w:t>主策略（ZP26）整体</w:t>
             </w:r>
           </w:p>
         </w:tc>
@@ -2007,10 +2106,50 @@
       <w:r>
         <w:rPr>
           <w:rFonts w:ascii="Times New Roman" w:hAnsi="Times New Roman" w:eastAsia="宋体"/>
+          <w:b/>
+          <w:sz w:val="24"/>
+        </w:rPr>
+        <w:t>ELCAJNGT（SP15）已单独训练但不可靠 ⚠</w:t>
+      </w:r>
+      <w:r>
+        <w:rPr>
+          <w:rFonts w:ascii="Times New Roman" w:hAnsi="Times New Roman" w:eastAsia="宋体"/>
           <w:b w:val="0"/>
           <w:sz w:val="24"/>
         </w:rPr>
-        <w:t>ELCAJNGT 未建模（数据不足）。</w:t>
+        <w:t xml:space="preserve">：方向准确率 62.3% 表面尚可，但价差幅度 32.6（SNLNDRO 的 4 倍）、交易率高达 93%（几乎不观望），错单亏损幅度大 → 回测套利 </w:t>
+      </w:r>
+      <w:r>
+        <w:rPr>
+          <w:rFonts w:ascii="Times New Roman" w:hAnsi="Times New Roman" w:eastAsia="宋体"/>
+          <w:b/>
+          <w:sz w:val="24"/>
+        </w:rPr>
+        <w:t>-8833</w:t>
+      </w:r>
+      <w:r>
+        <w:rPr>
+          <w:rFonts w:ascii="Times New Roman" w:hAnsi="Times New Roman" w:eastAsia="宋体"/>
+          <w:b w:val="0"/>
+          <w:sz w:val="24"/>
+        </w:rPr>
+        <w:t>。</w:t>
+      </w:r>
+      <w:r>
+        <w:rPr>
+          <w:rFonts w:ascii="Times New Roman" w:hAnsi="Times New Roman" w:eastAsia="宋体"/>
+          <w:b/>
+          <w:sz w:val="24"/>
+        </w:rPr>
+        <w:t>不建议实盘采用，仅供参考</w:t>
+      </w:r>
+      <w:r>
+        <w:rPr>
+          <w:rFonts w:ascii="Times New Roman" w:hAnsi="Times New Roman" w:eastAsia="宋体"/>
+          <w:b w:val="0"/>
+          <w:sz w:val="24"/>
+        </w:rPr>
+        <w:t>。</w:t>
       </w:r>
     </w:p>
     <w:p>
@@ -3367,7 +3506,7 @@
           <w:b/>
           <w:sz w:val="24"/>
         </w:rPr>
-        <w:t>ELCAJNGT 未训练</w:t>
+        <w:t>ELCAJNGT 不可靠</w:t>
       </w:r>
       <w:r>
         <w:rPr>
@@ -3375,7 +3514,41 @@
           <w:b w:val="0"/>
           <w:sz w:val="24"/>
         </w:rPr>
-        <w:t>；天气按"预报值"假设（若实测需改滞后特征）。</w:t>
+        <w:t xml:space="preserve">：已单独训练，但方向准确率仅 62.3%、回测套利 </w:t>
+      </w:r>
+      <w:r>
+        <w:rPr>
+          <w:rFonts w:ascii="Times New Roman" w:hAnsi="Times New Roman" w:eastAsia="宋体"/>
+          <w:b/>
+          <w:sz w:val="24"/>
+        </w:rPr>
+        <w:t>-8833</w:t>
+      </w:r>
+      <w:r>
+        <w:rPr>
+          <w:rFonts w:ascii="Times New Roman" w:hAnsi="Times New Roman" w:eastAsia="宋体"/>
+          <w:b w:val="0"/>
+          <w:sz w:val="24"/>
+        </w:rPr>
+        <w:t>。原因：① 价格数据仅 2026-03 起，训练仅约 3 个月（冷启动、无历史）；② SP15 只有它一个节点，peer 联动特征全缺失；③ 价差幅度大（32.6，SNLNDRO 的 4 倍），方向错的亏损不对称。主策略应只采用 ZP26 两节点。</w:t>
+      </w:r>
+    </w:p>
+    <w:p>
+      <w:pPr>
+        <w:pStyle w:val="ListNumber"/>
+        <w:numPr>
+          <w:ilvl w:val="0"/>
+          <w:numId w:val="11"/>
+        </w:numPr>
+        <w:spacing w:after="40" w:line="312" w:lineRule="auto"/>
+      </w:pPr>
+      <w:r>
+        <w:rPr>
+          <w:rFonts w:ascii="Times New Roman" w:hAnsi="Times New Roman" w:eastAsia="宋体"/>
+          <w:b w:val="0"/>
+          <w:sz w:val="24"/>
+        </w:rPr>
+        <w:t>天气按"预报值"假设（若实测需改滞后特征）。</w:t>
       </w:r>
     </w:p>
     <w:p>

</xml_diff>